<commit_message>
srs document and api doc
</commit_message>
<xml_diff>
--- a/Key Documents/tfl user stories.docx
+++ b/Key Documents/tfl user stories.docx
@@ -1116,7 +1116,10 @@
         <w:t>analyst</w:t>
       </w:r>
       <w:r>
-        <w:t>, I want to measure how resilient the network is under disruptions so I can identify critical stations and bottlenecks.</w:t>
+        <w:t>, I want to measure how resilient the network is under disruptions so I can identify critical stations and bottlenecks</w:t>
+      </w:r>
+      <w:r>
+        <w:t>002E</w:t>
       </w:r>
     </w:p>
     <w:p>
@@ -1642,6 +1645,14 @@
           <w:u w:val="single"/>
         </w:rPr>
         <w:t>US-15 – Scenario Reset Function</w:t>
+      </w:r>
+      <w:r>
+        <w:rPr>
+          <w:b/>
+          <w:bCs/>
+          <w:u w:val="single"/>
+        </w:rPr>
+        <w:t xml:space="preserve"> make it seem like you know</w:t>
       </w:r>
     </w:p>
     <w:p>
@@ -4630,6 +4641,7 @@
   <w:style w:type="character" w:default="1" w:styleId="DefaultParagraphFont">
     <w:name w:val="Default Paragraph Font"/>
     <w:uiPriority w:val="1"/>
+    <w:semiHidden/>
     <w:unhideWhenUsed/>
   </w:style>
   <w:style w:type="table" w:default="1" w:styleId="TableNormal">

</xml_diff>